<commit_message>
Definición del proyecto actualizada
</commit_message>
<xml_diff>
--- a/Definicion_de_Proyecto_AstroVisor_Actualizada_Equipo8.docx
+++ b/Definicion_de_Proyecto_AstroVisor_Actualizada_Equipo8.docx
@@ -243,7 +243,9 @@
             <w:pPr>
               <w:spacing w:after="24" w:line="259" w:lineRule="auto"/>
             </w:pPr>
-            <w:r/>
+            <w:r>
+              <w:t>17 de octubre de 2026 (ajuste posterior a primera revisión)</w:t>
+            </w:r>
             <w:r>
               <w:rPr>
                 <w:rFonts w:ascii="Aptos" w:hAnsi="Aptos"/>
@@ -251,7 +253,6 @@
                 <w:color w:val="132746"/>
                 <w:sz w:val="17"/>
               </w:rPr>
-              <w:t>08 de octubre de 2026</w:t>
             </w:r>
           </w:p>
         </w:tc>
@@ -304,7 +305,9 @@
             <w:pPr>
               <w:spacing w:after="24" w:line="259" w:lineRule="auto"/>
             </w:pPr>
-            <w:r/>
+            <w:r>
+              <w:t>Propuesta académica actualizada; público adulto mayor y temática provisional sujetos a validación y a material bibliográfico de la biblioteca</w:t>
+            </w:r>
             <w:r>
               <w:rPr>
                 <w:rFonts w:ascii="Aptos" w:hAnsi="Aptos"/>
@@ -312,7 +315,6 @@
                 <w:color w:val="132746"/>
                 <w:sz w:val="17"/>
               </w:rPr>
-              <w:t>Propuesta académica actualizada; sujeta a validación de contenido y condiciones institucionales</w:t>
             </w:r>
           </w:p>
         </w:tc>
@@ -506,7 +508,7 @@
     </w:p>
     <w:p>
       <w:r>
-        <w:t>AstroVisor es una plataforma web educativa de astronomía propuesta para actividades de divulgación de una biblioteca. Ofrece dos experiencias complementarias: (1) una interfaz web convencional, usable en computadora y dispositivos móviles y susceptible de mostrarse en televisión o proyector mediante un equipo compatible; y (2) un recorrido astronómico inmersivo en teléfonos colocados en visores Homido. Ambas comparten información y propósito educativo, pero no requieren ejecutarse ni sincronizarse al mismo tiempo.</w:t>
+        <w:t>AstroVisor es una plataforma web educativa de astronomía propuesta para actividades de divulgación de una biblioteca. Ofrece dos experiencias complementarias, diseñadas prioritariamente para personas adultas mayores: (1) una interfaz web convencional, usable en computadora y dispositivos móviles y susceptible de mostrarse en televisión o proyector mediante un equipo compatible; y (2) un recorrido astronómico inmersivo en teléfonos colocados en visores Homido. Ambas comparten información y propósito educativo, pero no requieren ejecutarse ni sincronizarse al mismo tiempo.</w:t>
       </w:r>
     </w:p>
     <w:p>
@@ -521,7 +523,7 @@
     </w:p>
     <w:p>
       <w:r>
-        <w:t>Para el primer incremento se propone concentrar la experiencia astronómica en el Sistema Solar y validar sus interfaces con los dispositivos que realmente estén disponibles. El énfasis académico continúa siendo el desarrollo de interfaces, la interacción, la usabilidad y su integración con un flujo administrativo funcional.</w:t>
+        <w:t>Para el primer incremento se propone trabajar provisionalmente la temática «Constelaciones e historias del cielo», mediante recorridos breves de observación de estrellas, relatos culturales y orientación nocturna. El público objetivo prioritario son personas adultas mayores de 60 años; el acceso seguirá disponible para otros visitantes. La selección final de contenidos, guion y libros dependerá del material de la biblioteca. El énfasis académico continúa siendo el desarrollo de interfaces, la interacción, la usabilidad y un flujo administrativo sencillo.</w:t>
       </w:r>
     </w:p>
     <w:p>
@@ -1032,7 +1034,9 @@
             <w:pPr>
               <w:spacing w:after="24" w:line="259" w:lineRule="auto"/>
             </w:pPr>
-            <w:r/>
+            <w:r>
+              <w:t>Constelaciones e historias del cielo como temática provisional; público principal de adultos mayores, selección por mirada, modo web/2D y administración documental simplificada.</w:t>
+            </w:r>
             <w:r>
               <w:rPr>
                 <w:rFonts w:ascii="Aptos" w:hAnsi="Aptos"/>
@@ -1040,7 +1044,6 @@
                 <w:color w:val="132746"/>
                 <w:sz w:val="15"/>
               </w:rPr>
-              <w:t>Sistema Solar como experiencia inicial; retícula por mirada, modo 2D y administración básica de contenidos.</w:t>
             </w:r>
           </w:p>
         </w:tc>
@@ -1060,7 +1063,9 @@
             <w:pPr>
               <w:spacing w:after="24" w:line="259" w:lineRule="auto"/>
             </w:pPr>
-            <w:r/>
+            <w:r>
+              <w:t>Ajuste a partir de primera revisión; selección final pendiente de guion y libros de la biblioteca.</w:t>
+            </w:r>
             <w:r>
               <w:rPr>
                 <w:rFonts w:ascii="Aptos" w:hAnsi="Aptos"/>
@@ -1068,7 +1073,6 @@
                 <w:color w:val="132746"/>
                 <w:sz w:val="15"/>
               </w:rPr>
-              <w:t>Sujeto a pruebas y alcance de la materia.</w:t>
             </w:r>
           </w:p>
         </w:tc>
@@ -1119,7 +1123,9 @@
             <w:pPr>
               <w:spacing w:after="24" w:line="259" w:lineRule="auto"/>
             </w:pPr>
-            <w:r/>
+            <w:r>
+              <w:t>Guion, audios, listado bibliográfico, recursos audiovisuales, compatibilidad Homido e infraestructura persistente.</w:t>
+            </w:r>
             <w:r>
               <w:rPr>
                 <w:rFonts w:ascii="Aptos" w:hAnsi="Aptos"/>
@@ -1127,7 +1133,6 @@
                 <w:color w:val="132746"/>
                 <w:sz w:val="15"/>
               </w:rPr>
-              <w:t>Guion, audios, inventario bibliográfico, recursos audiovisuales, compatibilidad de BD e infraestructura.</w:t>
             </w:r>
           </w:p>
         </w:tc>
@@ -1146,7 +1151,9 @@
             <w:pPr>
               <w:spacing w:after="24" w:line="259" w:lineRule="auto"/>
             </w:pPr>
-            <w:r/>
+            <w:r>
+              <w:t>Pendiente de entrega o validación con la biblioteca y durante las pruebas técnicas.</w:t>
+            </w:r>
             <w:r>
               <w:rPr>
                 <w:rFonts w:ascii="Aptos" w:hAnsi="Aptos"/>
@@ -1154,7 +1161,6 @@
                 <w:color w:val="132746"/>
                 <w:sz w:val="15"/>
               </w:rPr>
-              <w:t>Pendientes de entrega/validación por biblioteca u otros equipos.</w:t>
             </w:r>
           </w:p>
         </w:tc>
@@ -1222,7 +1228,7 @@
         <w:keepLines/>
       </w:pPr>
       <w:r>
-        <w:t>A visitantes que buscan aprender mediante recursos claros y atractivos; a estudiantes y docentes que pueden aprovechar una actividad guiada; al personal de biblioteca que desea orientar hacia su acervo; y a administradores que necesitarán mantener vigentes temas y referencias.</w:t>
+        <w:t>A personas adultas mayores de 60 años interesadas en aprender astronomía, como público objetivo prioritario; también a otros visitantes, docentes y mediadores que puedan aprovechar una actividad guiada, al personal de la biblioteca que desea orientar hacia su acervo y a administradores que mantendrán contenidos y referencias. Las necesidades específicas del público prioritario se validarán con usuarios reales.</w:t>
       </w:r>
     </w:p>
     <w:p>
@@ -1256,7 +1262,7 @@
         <w:keepLines/>
       </w:pPr>
       <w:r>
-        <w:t>Una experiencia accesible sin registro, con rutas separadas para página educativa, modo inmersivo y administración; información presentada con progresión y controles adecuados a cada dispositivo; materiales audiovisuales cuando estén autorizados; y recomendaciones bibliográficas contextualizadas.</w:t>
+        <w:t>Una experiencia sin registro, diseñada prioritariamente para adultos mayores y abierta a otros visitantes, con rutas separadas para página educativa, modo inmersivo y administración; navegación clara, tipografía legible, controles comprensibles, materiales audiovisuales complementarios y recomendaciones bibliográficas contextualizadas.</w:t>
       </w:r>
     </w:p>
     <w:p>
@@ -1357,7 +1363,7 @@
         <w:keepNext/>
       </w:pPr>
       <w:r>
-        <w:t>Representación visual del Sistema Solar que puede servir de referente para organización del contenido.</w:t>
+        <w:t>Representación visual del Sistema Solar que se conserva como antecedente comparativo, sin formar parte de la temática del MVP.</w:t>
       </w:r>
     </w:p>
     <w:p>
@@ -1365,7 +1371,7 @@
         <w:keepLines/>
       </w:pPr>
       <w:r>
-        <w:t>Análisis UX/UI preliminar: Ayuda a analizar cómo presentar cuerpos astronómicos de manera intuitiva.</w:t>
+        <w:t>Análisis UX/UI preliminar: Referente para evaluar claridad de navegación y presentación visual, no para replicar su recorrido temático.</w:t>
       </w:r>
     </w:p>
     <w:p>
@@ -2321,7 +2327,9 @@
             <w:pPr>
               <w:spacing w:after="24" w:line="259" w:lineRule="auto"/>
             </w:pPr>
-            <w:r/>
+            <w:r>
+              <w:t>Web de constelaciones e historias del cielo + Homido</w:t>
+            </w:r>
             <w:r>
               <w:rPr>
                 <w:rFonts w:ascii="Aptos" w:hAnsi="Aptos"/>
@@ -2329,7 +2337,6 @@
                 <w:color w:val="132746"/>
                 <w:sz w:val="14"/>
               </w:rPr>
-              <w:t>Web educativa + Homido</w:t>
             </w:r>
           </w:p>
         </w:tc>
@@ -2487,7 +2494,7 @@
     </w:p>
     <w:p>
       <w:r>
-        <w:t>AstroVisor busca integrar en una sola solución tres necesidades: divulgación astronómica desde una página accesible, una modalidad inmersiva para los visores existentes y administración de contenidos conectados con el acervo de la biblioteca. El valor propuesto no es la cantidad de objetos celestes ni la precisión de un simulador profesional, sino la coherencia educativa entre contenidos, interfaces y orientación hacia la consulta de libros.</w:t>
+        <w:t>AstroVisor busca integrar en una sola solución tres necesidades: divulgación de constelaciones e historias del cielo desde una página accesible, una modalidad inmersiva para los visores existentes y administración sencilla de contenidos conectados con el acervo de la biblioteca. El valor propuesto está en los recorridos contemplativos y comprensibles para adultos mayores, no en la cantidad de objetos ni en una simulación astronómica profesional.</w:t>
       </w:r>
     </w:p>
     <w:p>
@@ -2551,7 +2558,7 @@
     </w:p>
     <w:p>
       <w:r>
-        <w:t>Diseñar, desarrollar y evaluar un prototipo funcional de plataforma web para divulgación astronómica en biblioteca, con experiencia convencional, experiencia inmersiva opcional mediante Homido y panel de administración autenticado, conectando contenidos multimedia con recomendaciones de libros y priorizando la usabilidad de las interfaces.</w:t>
+        <w:t>Diseñar, desarrollar y evaluar un prototipo funcional de plataforma web de divulgación sobre constelaciones e historias del cielo, dirigido prioritariamente a personas adultas mayores, con experiencia convencional, experiencia inmersiva opcional mediante Homido y panel administrativo autenticado y simplificado, vinculando contenidos con referencias de libros y priorizando la usabilidad de las interfaces.</w:t>
       </w:r>
     </w:p>
     <w:p>
@@ -2567,7 +2574,7 @@
         <w:pStyle w:val="ListBullet"/>
       </w:pPr>
       <w:r>
-        <w:t>Diseñar un sistema visual y de navegación coherente para visitantes y administradores, validado en escritorio y móvil.</w:t>
+        <w:t>Diseñar un sistema visual y de navegación coherente para personas adultas mayores, demás visitantes y administradores, validado en escritorio y móvil.</w:t>
       </w:r>
     </w:p>
     <w:p>
@@ -2583,7 +2590,7 @@
         <w:pStyle w:val="ListBullet"/>
       </w:pPr>
       <w:r>
-        <w:t>Implementar un recorrido inmersivo inicial del Sistema Solar para Homido, sujeto a la compatibilidad verificada del smartphone, con modo alternativo 2D.</w:t>
+        <w:t>Implementar un recorrido inmersivo inicial sobre constelaciones y el cielo nocturno para Homido, mediante una escena educativa guiada, sujeto a la compatibilidad verificada del smartphone y con alternativa web/2D.</w:t>
       </w:r>
     </w:p>
     <w:p>
@@ -3269,12 +3276,12 @@
     </w:p>
     <w:p>
       <w:r>
-        <w:t>La experiencia web convencional y la inmersiva deberán reutilizar, cuando sea viable, entidades de contenido (tema astronómico, recurso multimedia y referencia bibliográfica). El panel administrativo modificará dichos datos mediante una capa de persistencia con control de acceso. El mecanismo de almacenamiento, framework de frontend, librería 3D, backend y proveedor de alojamiento deben elegirse y justificarse en D3, y validarse con la demo técnica requerida.</w:t>
+        <w:t>La experiencia web convencional y la inmersiva compartirán contenidos estructurados en documentos locales (por ejemplo, JSON para datos y Markdown para textos), con referencias a archivos multimedia y libros. El panel administrativo conservará autenticación y permitirá editar y guardar dichos documentos mediante una capa de servidor ligera y autorizada, sin implementar una base de datos relacional. Vue.js, A-Frame, Node.js y Express se mantienen como tecnologías seleccionadas a documentar en D3.</w:t>
       </w:r>
     </w:p>
     <w:p>
       <w:r>
-        <w:t>No se debe hacer depender el código de que la biblioteca resuelva inmediatamente el hosting o la integración de su base de datos: se propone abstraer la fuente de contenido para poder pasar de datos locales/de demostración a una API acordada. Eso no elimina la necesidad de persistencia real para demostrar la edición desde el panel.</w:t>
+        <w:t>La información bibliográfica, guion y recursos institucionales aún no se han recibido. Se utilizarán documentos de demostración claramente identificados, fáciles de sustituir. El guardado desde el panel requiere almacenamiento persistente real: los archivos locales de un despliegue efímero no bastan y el mecanismo definitivo se comprobará antes de publicar la demostración.</w:t>
       </w:r>
     </w:p>
     <w:p>
@@ -3287,7 +3294,7 @@
     </w:p>
     <w:p>
       <w:r>
-        <w:t>Los perfiles siguientes son hipótesis de diseño para estructurar interfaces y escenarios; no equivalen a entrevistas de usuarios finales ni a perfiles demográficos validados. La actividad D2 debe desarrollar las fichas de usuario y su matriz de contexto conforme a ISO 9241-210.</w:t>
+        <w:t>Los siguientes perfiles son hipótesis de diseño, no entrevistas validadas. Tras la primera revisión académica se prioriza a personas adultas mayores de 60 años con distintos niveles de familiaridad tecnológica, manteniendo los roles de visitante web, visitante con Homido, docente/mediador y administrador. D2 deberá validar comprensión, comodidad, legibilidad y navegación mediante usuarios reales cuando sea posible.</w:t>
       </w:r>
     </w:p>
     <w:tbl>
@@ -3440,7 +3447,9 @@
             <w:pPr>
               <w:spacing w:after="24" w:line="259" w:lineRule="auto"/>
             </w:pPr>
-            <w:r/>
+            <w:r>
+              <w:t>Explorar constelaciones y relatos del cielo, controlar recursos y encontrar libros relacionados.</w:t>
+            </w:r>
             <w:r>
               <w:rPr>
                 <w:rFonts w:ascii="Aptos" w:hAnsi="Aptos"/>
@@ -3448,7 +3457,6 @@
                 <w:color w:val="132746"/>
                 <w:sz w:val="16"/>
               </w:rPr>
-              <w:t>Explorar temas, reproducir recursos, encontrar libros relacionados.</w:t>
             </w:r>
           </w:p>
         </w:tc>
@@ -3468,7 +3476,9 @@
             <w:pPr>
               <w:spacing w:after="24" w:line="259" w:lineRule="auto"/>
             </w:pPr>
-            <w:r/>
+            <w:r>
+              <w:t>Público prioritario: adultos mayores de 60 años; móvil o escritorio; legibilidad, navegación sencilla, tiempos flexibles y multimedia opcional.</w:t>
+            </w:r>
             <w:r>
               <w:rPr>
                 <w:rFonts w:ascii="Aptos" w:hAnsi="Aptos"/>
@@ -3476,7 +3486,6 @@
                 <w:color w:val="132746"/>
                 <w:sz w:val="16"/>
               </w:rPr>
-              <w:t>Móvil o escritorio; niveles variables de conocimiento; evitar menú complejo, textos excesivos o multimedia obligatoria.</w:t>
             </w:r>
           </w:p>
         </w:tc>
@@ -3527,7 +3536,9 @@
             <w:pPr>
               <w:spacing w:after="24" w:line="259" w:lineRule="auto"/>
             </w:pPr>
-            <w:r/>
+            <w:r>
+              <w:t>Observar el cielo virtual y seleccionar constelaciones o puntos de interés.</w:t>
+            </w:r>
             <w:r>
               <w:rPr>
                 <w:rFonts w:ascii="Aptos" w:hAnsi="Aptos"/>
@@ -3535,7 +3546,6 @@
                 <w:color w:val="132746"/>
                 <w:sz w:val="16"/>
               </w:rPr>
-              <w:t>Observar y seleccionar objetos dentro de la experiencia inmersiva.</w:t>
             </w:r>
           </w:p>
         </w:tc>
@@ -3554,7 +3564,9 @@
             <w:pPr>
               <w:spacing w:after="24" w:line="259" w:lineRule="auto"/>
             </w:pPr>
-            <w:r/>
+            <w:r>
+              <w:t>Teléfono compatible propio o asignado por biblioteca; retícula por mirada, sesiones breves, alternativa web y salida accesible.</w:t>
+            </w:r>
             <w:r>
               <w:rPr>
                 <w:rFonts w:ascii="Aptos" w:hAnsi="Aptos"/>
@@ -3562,7 +3574,6 @@
                 <w:color w:val="132746"/>
                 <w:sz w:val="16"/>
               </w:rPr>
-              <w:t>Teléfono compatible en visor; interacción con mirada; sensibilidad a mareos, distracciones o errores de selección.</w:t>
             </w:r>
           </w:p>
         </w:tc>
@@ -3933,7 +3944,9 @@
             <w:pPr>
               <w:spacing w:after="24" w:line="259" w:lineRule="auto"/>
             </w:pPr>
-            <w:r/>
+            <w:r>
+              <w:t>Inicio → Explorar el cielo → Constelación → Estrellas/historia y recursos → Libros relacionados → Invitación a consultar préstamo.</w:t>
+            </w:r>
             <w:r>
               <w:rPr>
                 <w:rFonts w:ascii="Aptos" w:hAnsi="Aptos"/>
@@ -3941,7 +3954,6 @@
                 <w:color w:val="132746"/>
                 <w:sz w:val="16"/>
               </w:rPr>
-              <w:t>Inicio → Explorar astronomía → Tema/planeta → Texto, imagen, audio o video → Libros relacionados → Invitación a consultar préstamo.</w:t>
             </w:r>
           </w:p>
         </w:tc>
@@ -3992,7 +4004,9 @@
             <w:pPr>
               <w:spacing w:after="24" w:line="259" w:lineRule="auto"/>
             </w:pPr>
-            <w:r/>
+            <w:r>
+              <w:t>Inicio → Instrucciones → Compatibilidad → Cielo nocturno virtual → Mirar constelación/punto de interés → Información/narración → Pausa/salida.</w:t>
+            </w:r>
             <w:r>
               <w:rPr>
                 <w:rFonts w:ascii="Aptos" w:hAnsi="Aptos"/>
@@ -4000,7 +4014,6 @@
                 <w:color w:val="132746"/>
                 <w:sz w:val="16"/>
               </w:rPr>
-              <w:t>Inicio → Instrucciones de visor → Comprobar compatibilidad → Escena del Sistema Solar → Mirada a un punto de interés → Información/narración → Pausa/salida.</w:t>
             </w:r>
           </w:p>
         </w:tc>
@@ -4144,7 +4157,7 @@
         <w:pStyle w:val="ListBullet"/>
       </w:pPr>
       <w:r>
-        <w:t>Navegación visible y consistente, jerarquía por tema y terminología accesible.</w:t>
+        <w:t>Navegación visible y consistente, jerarquía por constelación, lenguaje cotidiano, instrucciones breves y controles reconocibles para personas adultas mayores.</w:t>
       </w:r>
     </w:p>
     <w:p>
@@ -4184,7 +4197,7 @@
         <w:pStyle w:val="ListBullet"/>
       </w:pPr>
       <w:r>
-        <w:t>Letras legibles y contraste suficiente en modo pantalla; revisión visual sobre el teléfono dentro del visor real.</w:t>
+        <w:t>Tamaño de letra ajustable, buen contraste, zonas de interacción amplias y lectura cómoda en web/pantalla; revisar la legibilidad del teléfono con el visor Homido real.</w:t>
       </w:r>
     </w:p>
     <w:p>
@@ -4361,7 +4374,9 @@
             <w:pPr>
               <w:spacing w:after="24" w:line="259" w:lineRule="auto"/>
             </w:pPr>
-            <w:r/>
+            <w:r>
+              <w:t>Inicio, navegación accesible, recorridos breves de constelaciones e historias del cielo, información educativa y multimedia opcional.</w:t>
+            </w:r>
             <w:r>
               <w:rPr>
                 <w:rFonts w:ascii="Aptos" w:hAnsi="Aptos"/>
@@ -4369,7 +4384,6 @@
                 <w:color w:val="132746"/>
                 <w:sz w:val="15"/>
               </w:rPr>
-              <w:t>Inicio, navegación, recorrido sobre el Sistema Solar, información temática, consumo multimedia.</w:t>
             </w:r>
           </w:p>
         </w:tc>
@@ -4389,7 +4403,9 @@
             <w:pPr>
               <w:spacing w:after="24" w:line="259" w:lineRule="auto"/>
             </w:pPr>
-            <w:r/>
+            <w:r>
+              <w:t>Un adulto mayor puede completar un recorrido educativo sin visor ni registro; validar con usuarios de referencia.</w:t>
+            </w:r>
             <w:r>
               <w:rPr>
                 <w:rFonts w:ascii="Aptos" w:hAnsi="Aptos"/>
@@ -4397,7 +4413,6 @@
                 <w:color w:val="132746"/>
                 <w:sz w:val="15"/>
               </w:rPr>
-              <w:t>Un visitante puede completar un recorrido educativo sin visor ni registro.</w:t>
             </w:r>
           </w:p>
         </w:tc>
@@ -4711,7 +4726,9 @@
             <w:pPr>
               <w:spacing w:after="24" w:line="259" w:lineRule="auto"/>
             </w:pPr>
-            <w:r/>
+            <w:r>
+              <w:t>Ingreso solo para administradores; edición básica de documentos de recorridos, referencias multimedia y libros mediante formularios.</w:t>
+            </w:r>
             <w:r>
               <w:rPr>
                 <w:rFonts w:ascii="Aptos" w:hAnsi="Aptos"/>
@@ -4719,7 +4736,6 @@
                 <w:color w:val="132746"/>
                 <w:sz w:val="15"/>
               </w:rPr>
-              <w:t>Ingreso solo de administradores; altas/cambios básicos de contenidos, multimedia y fichas bibliográficas.</w:t>
             </w:r>
           </w:p>
         </w:tc>
@@ -4739,7 +4755,9 @@
             <w:pPr>
               <w:spacing w:after="24" w:line="259" w:lineRule="auto"/>
             </w:pPr>
-            <w:r/>
+            <w:r>
+              <w:t>Cambios autorizados guardados en archivos persistentes y reflejados en la experiencia pública; sin base de datos relacional.</w:t>
+            </w:r>
             <w:r>
               <w:rPr>
                 <w:rFonts w:ascii="Aptos" w:hAnsi="Aptos"/>
@@ -4747,7 +4765,6 @@
                 <w:color w:val="132746"/>
                 <w:sz w:val="15"/>
               </w:rPr>
-              <w:t>Los cambios autorizados persisten y pueden reflejarse en la experiencia pública.</w:t>
             </w:r>
           </w:p>
         </w:tc>
@@ -4889,7 +4906,7 @@
         <w:pStyle w:val="ListBullet"/>
       </w:pPr>
       <w:r>
-        <w:t>Integrar obligatoriamente la base de datos del otro equipo mientras no exista contrato técnico confirmado.</w:t>
+        <w:t>Integrar obligatoriamente sistemas de datos institucionales mientras no exista una necesidad y un mecanismo de integración definidos por la biblioteca.</w:t>
       </w:r>
     </w:p>
     <w:p>
@@ -4985,7 +5002,9 @@
             <w:pPr>
               <w:spacing w:after="24" w:line="259" w:lineRule="auto"/>
             </w:pPr>
-            <w:r/>
+            <w:r>
+              <w:t>Estado al 17/10/2026</w:t>
+            </w:r>
             <w:r>
               <w:rPr>
                 <w:rFonts w:ascii="Aptos" w:hAnsi="Aptos"/>
@@ -4993,7 +5012,6 @@
                 <w:color w:val="FFFFFF"/>
                 <w:sz w:val="15"/>
               </w:rPr>
-              <w:t>Estado al 08/10/2026</w:t>
             </w:r>
           </w:p>
         </w:tc>
@@ -5309,7 +5327,9 @@
             <w:pPr>
               <w:spacing w:after="24" w:line="259" w:lineRule="auto"/>
             </w:pPr>
-            <w:r/>
+            <w:r>
+              <w:t>Persistencia documental del panel</w:t>
+            </w:r>
             <w:r>
               <w:rPr>
                 <w:rFonts w:ascii="Aptos" w:hAnsi="Aptos"/>
@@ -5317,7 +5337,6 @@
                 <w:color w:val="132746"/>
                 <w:sz w:val="16"/>
               </w:rPr>
-              <w:t>BD institucional</w:t>
             </w:r>
           </w:p>
         </w:tc>
@@ -5336,7 +5355,9 @@
             <w:pPr>
               <w:spacing w:after="24" w:line="259" w:lineRule="auto"/>
             </w:pPr>
-            <w:r/>
+            <w:r>
+              <w:t>Se ha acordado evitar una base de datos relacional y utilizar documentos estructurados.</w:t>
+            </w:r>
             <w:r>
               <w:rPr>
                 <w:rFonts w:ascii="Aptos" w:hAnsi="Aptos"/>
@@ -5344,7 +5365,6 @@
                 <w:color w:val="132746"/>
                 <w:sz w:val="16"/>
               </w:rPr>
-              <w:t>Otro equipo estudia migración y reestructuración.</w:t>
             </w:r>
           </w:p>
         </w:tc>
@@ -5363,7 +5383,9 @@
             <w:pPr>
               <w:spacing w:after="24" w:line="259" w:lineRule="auto"/>
             </w:pPr>
-            <w:r/>
+            <w:r>
+              <w:t>Definir guardado seguro de JSON/Markdown, copias de respaldo y alojamiento con almacenamiento persistente.</w:t>
+            </w:r>
             <w:r>
               <w:rPr>
                 <w:rFonts w:ascii="Aptos" w:hAnsi="Aptos"/>
@@ -5371,7 +5393,6 @@
                 <w:color w:val="132746"/>
                 <w:sz w:val="16"/>
               </w:rPr>
-              <w:t>Solicitar esquema/API/exportación; desacoplar integraciones.</w:t>
             </w:r>
           </w:p>
         </w:tc>
@@ -5926,7 +5947,9 @@
             <w:pPr>
               <w:spacing w:after="24" w:line="259" w:lineRule="auto"/>
             </w:pPr>
-            <w:r/>
+            <w:r>
+              <w:t>Mostrar fichas de constelaciones, sus principales estrellas y relatos educativos con información textual y recursos visuales asociados.</w:t>
+            </w:r>
             <w:r>
               <w:rPr>
                 <w:rFonts w:ascii="Aptos" w:hAnsi="Aptos"/>
@@ -5934,7 +5957,6 @@
                 <w:color w:val="132746"/>
                 <w:sz w:val="16"/>
               </w:rPr>
-              <w:t>Mostrar fichas de temas/planetas con información textual y recursos visuales asociados.</w:t>
             </w:r>
           </w:p>
         </w:tc>
@@ -7617,7 +7639,9 @@
             <w:pPr>
               <w:spacing w:after="24" w:line="259" w:lineRule="auto"/>
             </w:pPr>
-            <w:r/>
+            <w:r>
+              <w:t>La persona adulta mayor reconoce las opciones web y Homido, completa un recorrido y puede volver al inicio; evaluar éxito y errores mediante pruebas moderadas.</w:t>
+            </w:r>
             <w:r>
               <w:rPr>
                 <w:rFonts w:ascii="Aptos" w:hAnsi="Aptos"/>
@@ -7625,7 +7649,6 @@
                 <w:color w:val="132746"/>
                 <w:sz w:val="15"/>
               </w:rPr>
-              <w:t>El usuario debe reconocer desde inicio las opciones web y Homido. Evaluar tasa de éxito y errores mediante pruebas moderadas.</w:t>
             </w:r>
           </w:p>
         </w:tc>
@@ -7703,7 +7726,9 @@
             <w:pPr>
               <w:spacing w:after="24" w:line="259" w:lineRule="auto"/>
             </w:pPr>
-            <w:r/>
+            <w:r>
+              <w:t>Objetivo: WCAG 2.2 nivel AA donde aplique; tipografía ajustable, contraste, foco visible, objetivos de toque amplios, etiquetas y operación por teclado, mouse y toque.</w:t>
+            </w:r>
             <w:r>
               <w:rPr>
                 <w:rFonts w:ascii="Aptos" w:hAnsi="Aptos"/>
@@ -7711,7 +7736,6 @@
                 <w:color w:val="132746"/>
                 <w:sz w:val="15"/>
               </w:rPr>
-              <w:t>Objetivo: WCAG 2.2 nivel AA donde sea aplicable a web; contraste, foco visible, etiquetas y operación con teclado, mouse y toque.</w:t>
             </w:r>
           </w:p>
         </w:tc>
@@ -8610,7 +8634,7 @@
         <w:pStyle w:val="ListBullet"/>
       </w:pPr>
       <w:r>
-        <w:t>Un visitante navega desde el inicio hasta un tema del Sistema Solar sin registrarse ni utilizar visor.</w:t>
+        <w:t>Un visitante, prioritariamente adulto mayor, navega desde el inicio hasta un recorrido de constelaciones e historias del cielo sin registrarse ni utilizar visor.</w:t>
       </w:r>
     </w:p>
     <w:p>
@@ -8682,7 +8706,7 @@
         <w:pStyle w:val="ListBullet"/>
       </w:pPr>
       <w:r>
-        <w:t>Stack final de frontend, motor 3D, backend/autenticación, persistencia y repositorio: documentar selección y justificación en D3.</w:t>
+        <w:t>Tecnologías seleccionadas en D3: Vue.js, A-Frame/Three.js y Node.js/Express con persistencia documental (JSON/Markdown); confirmar configuración de autenticación, guardado seguro y alojamiento demostrable.</w:t>
       </w:r>
     </w:p>
     <w:p>
@@ -8714,7 +8738,7 @@
         <w:pStyle w:val="ListBullet"/>
       </w:pPr>
       <w:r>
-        <w:t>Integración con base de datos central del otro equipo: pendiente de disponibilidad de interfaz y acuerdos.</w:t>
+        <w:t>Persistencia del panel administrativo en el alojamiento: verificar almacenamiento escribible y duradero para los documentos editados.</w:t>
       </w:r>
     </w:p>
     <w:p>
@@ -8997,7 +9021,9 @@
             <w:pPr>
               <w:spacing w:after="24" w:line="259" w:lineRule="auto"/>
             </w:pPr>
-            <w:r/>
+            <w:r>
+              <w:t>Tecnologías elegidas y justificadas, seguridad/archivos documentales/hosting/repositorio y demo funcional.</w:t>
+            </w:r>
             <w:r>
               <w:rPr>
                 <w:rFonts w:ascii="Aptos" w:hAnsi="Aptos"/>
@@ -9005,7 +9031,6 @@
                 <w:color w:val="132746"/>
                 <w:sz w:val="16"/>
               </w:rPr>
-              <w:t>Tecnologías concretas justificadas, seguridad/BD/hosting/repositorio y demo funcional.</w:t>
             </w:r>
           </w:p>
         </w:tc>
@@ -9234,7 +9259,9 @@
             <w:pPr>
               <w:spacing w:after="24" w:line="259" w:lineRule="auto"/>
             </w:pPr>
-            <w:r/>
+            <w:r>
+              <w:t>Wireframes para adultos mayores, prueba inicial Homido, estructura JSON/Markdown y repositorio/administración.</w:t>
+            </w:r>
             <w:r>
               <w:rPr>
                 <w:rFonts w:ascii="Aptos" w:hAnsi="Aptos"/>
@@ -9242,7 +9269,6 @@
                 <w:color w:val="132746"/>
                 <w:sz w:val="16"/>
               </w:rPr>
-              <w:t>Diseño de wireframes, prueba inicial Homido, modelo de contenidos y estructura de repositorio/administración.</w:t>
             </w:r>
           </w:p>
         </w:tc>
@@ -9413,7 +9439,9 @@
             <w:pPr>
               <w:spacing w:after="24" w:line="259" w:lineRule="auto"/>
             </w:pPr>
-            <w:r/>
+            <w:r>
+              <w:t>Guardado persistente en documentos y asociaciones recorrido-libro-recurso, proyección web y navegación inmersiva.</w:t>
+            </w:r>
             <w:r>
               <w:rPr>
                 <w:rFonts w:ascii="Aptos" w:hAnsi="Aptos"/>
@@ -9421,7 +9449,6 @@
                 <w:color w:val="132746"/>
                 <w:sz w:val="16"/>
               </w:rPr>
-              <w:t>Persistencia y asociaciones tema-libro-recurso, proyección web y navegación inmersiva.</w:t>
             </w:r>
           </w:p>
         </w:tc>
@@ -9770,7 +9797,7 @@
     </w:p>
     <w:p>
       <w:r>
-        <w:t>Cuando lleguen el guion, catálogo, especificaciones de BD o decisiones sobre acceso, actualizar primero los apartados “Acuerdos, propuestas y asuntos abiertos”, “Restricciones y dependencias” y los RF/RNF afectados. Registrar fecha, responsable y fundamento del cambio. Después sincronizar D2 (perfiles/flujos), D3 (stack y arquitectura) y D4 (tareas/fechas). No presentar contenido de demostración como dato institucional verificado.</w:t>
+        <w:t>Cuando lleguen el guion, catálogo o decisiones sobre alojamiento y acceso, actualizar primero los apartados «Acuerdos, propuestas y asuntos abiertos», «Restricciones y dependencias» y los RF/RNF afectados. Registrar fecha, responsable y fundamento. Después sincronizar D2 (público objetivo/perfiles/flujos), D3 (persistencia documental y despliegue) y D4 (tareas/fechas). No presentar datos de demostración como información institucional verificada.</w:t>
       </w:r>
     </w:p>
     <w:sectPr>

</xml_diff>